<commit_message>
O'taniyozov, Meyliyev mustaqil ish
</commit_message>
<xml_diff>
--- a/Dars materiallari 2025-2026/Sun'iy intellekt asoslari 2025-2026/7.1 Mashinali o‘qitish algoritmlari haqida umumiy tushuncha/2. Nazorat ostida o'qitish (Supervised Learning).docx
+++ b/Dars materiallari 2025-2026/Sun'iy intellekt asoslari 2025-2026/7.1 Mashinali o‘qitish algoritmlari haqida umumiy tushuncha/2. Nazorat ostida o'qitish (Supervised Learning).docx
@@ -1,6 +1,6 @@
 
 <file path=word/document.xml><?xml version="1.0" encoding="utf-8"?>
-<w:document xmlns:wpc="http://schemas.microsoft.com/office/word/2010/wordprocessingCanvas" xmlns:cx="http://schemas.microsoft.com/office/drawing/2014/chartex" xmlns:cx1="http://schemas.microsoft.com/office/drawing/2015/9/8/chartex" xmlns:cx2="http://schemas.microsoft.com/office/drawing/2015/10/21/chartex" xmlns:cx3="http://schemas.microsoft.com/office/drawing/2016/5/9/chartex" xmlns:cx4="http://schemas.microsoft.com/office/drawing/2016/5/10/chartex" xmlns:cx5="http://schemas.microsoft.com/office/drawing/2016/5/11/chartex" xmlns:cx6="http://schemas.microsoft.com/office/drawing/2016/5/12/chartex" xmlns:cx7="http://schemas.microsoft.com/office/drawing/2016/5/13/chartex" xmlns:cx8="http://schemas.microsoft.com/office/drawing/2016/5/14/chartex" xmlns:mc="http://schemas.openxmlformats.org/markup-compatibility/2006" xmlns:aink="http://schemas.microsoft.com/office/drawing/2016/ink" xmlns:am3d="http://schemas.microsoft.com/office/drawing/2017/model3d" xmlns:o="urn:schemas-microsoft-com:office:office" xmlns:r="http://schemas.openxmlformats.org/officeDocument/2006/relationships" xmlns:m="http://schemas.openxmlformats.org/officeDocument/2006/math" xmlns:v="urn:schemas-microsoft-com:vml" xmlns:wp14="http://schemas.microsoft.com/office/word/2010/wordprocessingDrawing" xmlns:wp="http://schemas.openxmlformats.org/drawingml/2006/wordprocessingDrawing" xmlns:w10="urn:schemas-microsoft-com:office:word" xmlns:w="http://schemas.openxmlformats.org/wordprocessingml/2006/main" xmlns:w14="http://schemas.microsoft.com/office/word/2010/wordml" xmlns:w15="http://schemas.microsoft.com/office/word/2012/wordml" xmlns:w16cid="http://schemas.microsoft.com/office/word/2016/wordml/cid" xmlns:w16se="http://schemas.microsoft.com/office/word/2015/wordml/symex" xmlns:wpg="http://schemas.microsoft.com/office/word/2010/wordprocessingGroup" xmlns:wpi="http://schemas.microsoft.com/office/word/2010/wordprocessingInk" xmlns:wne="http://schemas.microsoft.com/office/word/2006/wordml" xmlns:wps="http://schemas.microsoft.com/office/word/2010/wordprocessingShape" mc:Ignorable="w14 w15 w16se w16cid wp14">
+<w:document xmlns:wpc="http://schemas.microsoft.com/office/word/2010/wordprocessingCanvas" xmlns:cx="http://schemas.microsoft.com/office/drawing/2014/chartex" xmlns:cx1="http://schemas.microsoft.com/office/drawing/2015/9/8/chartex" xmlns:cx2="http://schemas.microsoft.com/office/drawing/2015/10/21/chartex" xmlns:cx3="http://schemas.microsoft.com/office/drawing/2016/5/9/chartex" xmlns:cx4="http://schemas.microsoft.com/office/drawing/2016/5/10/chartex" xmlns:cx5="http://schemas.microsoft.com/office/drawing/2016/5/11/chartex" xmlns:cx6="http://schemas.microsoft.com/office/drawing/2016/5/12/chartex" xmlns:cx7="http://schemas.microsoft.com/office/drawing/2016/5/13/chartex" xmlns:cx8="http://schemas.microsoft.com/office/drawing/2016/5/14/chartex" xmlns:mc="http://schemas.openxmlformats.org/markup-compatibility/2006" xmlns:aink="http://schemas.microsoft.com/office/drawing/2016/ink" xmlns:am3d="http://schemas.microsoft.com/office/drawing/2017/model3d" xmlns:o="urn:schemas-microsoft-com:office:office" xmlns:r="http://schemas.openxmlformats.org/officeDocument/2006/relationships" xmlns:m="http://schemas.openxmlformats.org/officeDocument/2006/math" xmlns:v="urn:schemas-microsoft-com:vml" xmlns:wp14="http://schemas.microsoft.com/office/word/2010/wordprocessingDrawing" xmlns:wp="http://schemas.openxmlformats.org/drawingml/2006/wordprocessingDrawing" xmlns:w10="urn:schemas-microsoft-com:office:word" xmlns:w="http://schemas.openxmlformats.org/wordprocessingml/2006/main" xmlns:w14="http://schemas.microsoft.com/office/word/2010/wordml" xmlns:w15="http://schemas.microsoft.com/office/word/2012/wordml" xmlns:w16cex="http://schemas.microsoft.com/office/word/2018/wordml/cex" xmlns:w16cid="http://schemas.microsoft.com/office/word/2016/wordml/cid" xmlns:w16="http://schemas.microsoft.com/office/word/2018/wordml" xmlns:w16sdtdh="http://schemas.microsoft.com/office/word/2020/wordml/sdtdatahash" xmlns:w16se="http://schemas.microsoft.com/office/word/2015/wordml/symex" xmlns:wpg="http://schemas.microsoft.com/office/word/2010/wordprocessingGroup" xmlns:wpi="http://schemas.microsoft.com/office/word/2010/wordprocessingInk" xmlns:wne="http://schemas.microsoft.com/office/word/2006/wordml" xmlns:wps="http://schemas.microsoft.com/office/word/2010/wordprocessingShape" mc:Ignorable="w14 w15 w16se w16cid w16 w16cex w16sdtdh wp14">
   <w:body>
     <w:p>
       <w:pPr>
@@ -403,7 +403,27 @@
           <w:szCs w:val="28"/>
           <w:lang w:val="en-US"/>
         </w:rPr>
-        <w:t xml:space="preserve"> har </w:t>
+        <w:t xml:space="preserve"> </w:t>
+      </w:r>
+      <w:proofErr w:type="spellStart"/>
+      <w:r>
+        <w:rPr>
+          <w:color w:val="1F1F1F"/>
+          <w:sz w:val="28"/>
+          <w:szCs w:val="28"/>
+          <w:lang w:val="en-US"/>
+        </w:rPr>
+        <w:t>har</w:t>
+      </w:r>
+      <w:proofErr w:type="spellEnd"/>
+      <w:r>
+        <w:rPr>
+          <w:color w:val="1F1F1F"/>
+          <w:sz w:val="28"/>
+          <w:szCs w:val="28"/>
+          <w:lang w:val="en-US"/>
+        </w:rPr>
+        <w:t xml:space="preserve"> </w:t>
       </w:r>
       <w:proofErr w:type="spellStart"/>
       <w:r>
@@ -1666,7 +1686,7 @@
                     </pic:cNvPicPr>
                   </pic:nvPicPr>
                   <pic:blipFill>
-                    <a:blip r:embed="rId5">
+                    <a:blip r:embed="rId7">
                       <a:extLst>
                         <a:ext uri="{28A0092B-C50C-407E-A947-70E740481C1C}">
                           <a14:useLocalDpi xmlns:a14="http://schemas.microsoft.com/office/drawing/2010/main" val="0"/>
@@ -2647,7 +2667,27 @@
           <w:szCs w:val="28"/>
           <w:lang w:val="en-US"/>
         </w:rPr>
-        <w:t xml:space="preserve">, har </w:t>
+        <w:t xml:space="preserve">, </w:t>
+      </w:r>
+      <w:proofErr w:type="spellStart"/>
+      <w:r>
+        <w:rPr>
+          <w:color w:val="1F1F1F"/>
+          <w:sz w:val="28"/>
+          <w:szCs w:val="28"/>
+          <w:lang w:val="en-US"/>
+        </w:rPr>
+        <w:t>har</w:t>
+      </w:r>
+      <w:proofErr w:type="spellEnd"/>
+      <w:r>
+        <w:rPr>
+          <w:color w:val="1F1F1F"/>
+          <w:sz w:val="28"/>
+          <w:szCs w:val="28"/>
+          <w:lang w:val="en-US"/>
+        </w:rPr>
+        <w:t xml:space="preserve"> </w:t>
       </w:r>
       <w:proofErr w:type="spellStart"/>
       <w:r>
@@ -6867,7 +6907,7 @@
                     </pic:cNvPicPr>
                   </pic:nvPicPr>
                   <pic:blipFill>
-                    <a:blip r:embed="rId6">
+                    <a:blip r:embed="rId8">
                       <a:extLst>
                         <a:ext uri="{28A0092B-C50C-407E-A947-70E740481C1C}">
                           <a14:useLocalDpi xmlns:a14="http://schemas.microsoft.com/office/drawing/2010/main" val="0"/>
@@ -8132,7 +8172,7 @@
                     </pic:cNvPicPr>
                   </pic:nvPicPr>
                   <pic:blipFill>
-                    <a:blip r:embed="rId7">
+                    <a:blip r:embed="rId9">
                       <a:extLst>
                         <a:ext uri="{28A0092B-C50C-407E-A947-70E740481C1C}">
                           <a14:useLocalDpi xmlns:a14="http://schemas.microsoft.com/office/drawing/2010/main" val="0"/>
@@ -8191,7 +8231,27 @@
           <w:szCs w:val="28"/>
           <w:lang w:val="en-US" w:eastAsia="ru-RU"/>
         </w:rPr>
-        <w:t xml:space="preserve"> har </w:t>
+        <w:t xml:space="preserve"> </w:t>
+      </w:r>
+      <w:proofErr w:type="spellStart"/>
+      <w:r>
+        <w:rPr>
+          <w:rFonts w:eastAsia="Times New Roman"/>
+          <w:color w:val="1F1F1F"/>
+          <w:szCs w:val="28"/>
+          <w:lang w:val="en-US" w:eastAsia="ru-RU"/>
+        </w:rPr>
+        <w:t>har</w:t>
+      </w:r>
+      <w:proofErr w:type="spellEnd"/>
+      <w:r>
+        <w:rPr>
+          <w:rFonts w:eastAsia="Times New Roman"/>
+          <w:color w:val="1F1F1F"/>
+          <w:szCs w:val="28"/>
+          <w:lang w:val="en-US" w:eastAsia="ru-RU"/>
+        </w:rPr>
+        <w:t xml:space="preserve"> </w:t>
       </w:r>
       <w:proofErr w:type="spellStart"/>
       <w:r>
@@ -9957,7 +10017,7 @@
           <w:lang w:eastAsia="ru-RU"/>
         </w:rPr>
         <w:pict w14:anchorId="5278F3DA">
-          <v:rect id="_x0000_i1097" style="width:0;height:1.5pt" o:hralign="center" o:hrstd="t" o:hrnoshade="t" o:hr="t" fillcolor="gray" stroked="f"/>
+          <v:rect id="_x0000_i1025" style="width:0;height:1.5pt" o:hralign="center" o:hrstd="t" o:hrnoshade="t" o:hr="t" fillcolor="gray" stroked="f"/>
         </w:pict>
       </w:r>
     </w:p>
@@ -13312,7 +13372,7 @@
           <w:lang w:eastAsia="ru-RU"/>
         </w:rPr>
         <w:pict w14:anchorId="052FD614">
-          <v:rect id="_x0000_i1098" style="width:0;height:1.5pt" o:hralign="center" o:hrstd="t" o:hrnoshade="t" o:hr="t" fillcolor="gray" stroked="f"/>
+          <v:rect id="_x0000_i1026" style="width:0;height:1.5pt" o:hralign="center" o:hrstd="t" o:hrnoshade="t" o:hr="t" fillcolor="gray" stroked="f"/>
         </w:pict>
       </w:r>
     </w:p>
@@ -15273,7 +15333,27 @@
           <w:szCs w:val="28"/>
           <w:lang w:val="en-US" w:eastAsia="ru-RU"/>
         </w:rPr>
-        <w:t xml:space="preserve"> har </w:t>
+        <w:t xml:space="preserve"> </w:t>
+      </w:r>
+      <w:proofErr w:type="spellStart"/>
+      <w:r>
+        <w:rPr>
+          <w:rFonts w:eastAsia="Times New Roman"/>
+          <w:color w:val="1F1F1F"/>
+          <w:szCs w:val="28"/>
+          <w:lang w:val="en-US" w:eastAsia="ru-RU"/>
+        </w:rPr>
+        <w:t>har</w:t>
+      </w:r>
+      <w:proofErr w:type="spellEnd"/>
+      <w:r>
+        <w:rPr>
+          <w:rFonts w:eastAsia="Times New Roman"/>
+          <w:color w:val="1F1F1F"/>
+          <w:szCs w:val="28"/>
+          <w:lang w:val="en-US" w:eastAsia="ru-RU"/>
+        </w:rPr>
+        <w:t xml:space="preserve"> </w:t>
       </w:r>
       <w:proofErr w:type="spellStart"/>
       <w:r>
@@ -15353,7 +15433,27 @@
           <w:szCs w:val="28"/>
           <w:lang w:val="en-US" w:eastAsia="ru-RU"/>
         </w:rPr>
-        <w:t xml:space="preserve">, har </w:t>
+        <w:t xml:space="preserve">, </w:t>
+      </w:r>
+      <w:proofErr w:type="spellStart"/>
+      <w:r>
+        <w:rPr>
+          <w:rFonts w:eastAsia="Times New Roman"/>
+          <w:color w:val="1F1F1F"/>
+          <w:szCs w:val="28"/>
+          <w:lang w:val="en-US" w:eastAsia="ru-RU"/>
+        </w:rPr>
+        <w:t>har</w:t>
+      </w:r>
+      <w:proofErr w:type="spellEnd"/>
+      <w:r>
+        <w:rPr>
+          <w:rFonts w:eastAsia="Times New Roman"/>
+          <w:color w:val="1F1F1F"/>
+          <w:szCs w:val="28"/>
+          <w:lang w:val="en-US" w:eastAsia="ru-RU"/>
+        </w:rPr>
+        <w:t xml:space="preserve"> </w:t>
       </w:r>
       <w:proofErr w:type="spellStart"/>
       <w:r>
@@ -15872,7 +15972,27 @@
           <w:szCs w:val="28"/>
           <w:lang w:val="en-US" w:eastAsia="ru-RU"/>
         </w:rPr>
-        <w:t xml:space="preserve"> har </w:t>
+        <w:t xml:space="preserve"> </w:t>
+      </w:r>
+      <w:proofErr w:type="spellStart"/>
+      <w:r>
+        <w:rPr>
+          <w:rFonts w:eastAsia="Times New Roman"/>
+          <w:color w:val="1F1F1F"/>
+          <w:szCs w:val="28"/>
+          <w:lang w:val="en-US" w:eastAsia="ru-RU"/>
+        </w:rPr>
+        <w:t>har</w:t>
+      </w:r>
+      <w:proofErr w:type="spellEnd"/>
+      <w:r>
+        <w:rPr>
+          <w:rFonts w:eastAsia="Times New Roman"/>
+          <w:color w:val="1F1F1F"/>
+          <w:szCs w:val="28"/>
+          <w:lang w:val="en-US" w:eastAsia="ru-RU"/>
+        </w:rPr>
+        <w:t xml:space="preserve"> </w:t>
       </w:r>
       <w:proofErr w:type="spellStart"/>
       <w:r>
@@ -19140,35 +19260,7 @@
                 <w:bdr w:val="none" w:sz="0" w:space="0" w:color="auto" w:frame="1"/>
                 <w:lang w:eastAsia="ru-RU"/>
               </w:rPr>
-              <w:t xml:space="preserve"> (</w:t>
-            </w:r>
-            <w:proofErr w:type="spellStart"/>
-            <w:r>
-              <w:rPr>
-                <w:rFonts w:eastAsia="Times New Roman"/>
-                <w:b/>
-                <w:bCs/>
-                <w:color w:val="1F1F1F"/>
-                <w:sz w:val="24"/>
-                <w:szCs w:val="24"/>
-                <w:bdr w:val="none" w:sz="0" w:space="0" w:color="auto" w:frame="1"/>
-                <w:lang w:eastAsia="ru-RU"/>
-              </w:rPr>
-              <w:t>Type</w:t>
-            </w:r>
-            <w:proofErr w:type="spellEnd"/>
-            <w:r>
-              <w:rPr>
-                <w:rFonts w:eastAsia="Times New Roman"/>
-                <w:b/>
-                <w:bCs/>
-                <w:color w:val="1F1F1F"/>
-                <w:sz w:val="24"/>
-                <w:szCs w:val="24"/>
-                <w:bdr w:val="none" w:sz="0" w:space="0" w:color="auto" w:frame="1"/>
-                <w:lang w:eastAsia="ru-RU"/>
-              </w:rPr>
-              <w:t>)</w:t>
+              <w:t xml:space="preserve"> (Type)</w:t>
             </w:r>
           </w:p>
         </w:tc>
@@ -21996,7 +22088,7 @@
                 <w:bdr w:val="none" w:sz="0" w:space="0" w:color="auto" w:frame="1"/>
                 <w:lang w:eastAsia="ru-RU"/>
               </w:rPr>
-              <w:t xml:space="preserve"> (</w:t>
+              <w:t xml:space="preserve"> (Support </w:t>
             </w:r>
             <w:proofErr w:type="spellStart"/>
             <w:r>
@@ -22008,7 +22100,7 @@
                 <w:bdr w:val="none" w:sz="0" w:space="0" w:color="auto" w:frame="1"/>
                 <w:lang w:eastAsia="ru-RU"/>
               </w:rPr>
-              <w:t>Support</w:t>
+              <w:t>Vector</w:t>
             </w:r>
             <w:proofErr w:type="spellEnd"/>
             <w:r>
@@ -22020,55 +22112,7 @@
                 <w:bdr w:val="none" w:sz="0" w:space="0" w:color="auto" w:frame="1"/>
                 <w:lang w:eastAsia="ru-RU"/>
               </w:rPr>
-              <w:t xml:space="preserve"> </w:t>
-            </w:r>
-            <w:proofErr w:type="spellStart"/>
-            <w:r>
-              <w:rPr>
-                <w:rFonts w:eastAsia="Times New Roman"/>
-                <w:color w:val="1F1F1F"/>
-                <w:sz w:val="24"/>
-                <w:szCs w:val="24"/>
-                <w:bdr w:val="none" w:sz="0" w:space="0" w:color="auto" w:frame="1"/>
-                <w:lang w:eastAsia="ru-RU"/>
-              </w:rPr>
-              <w:t>Vector</w:t>
-            </w:r>
-            <w:proofErr w:type="spellEnd"/>
-            <w:r>
-              <w:rPr>
-                <w:rFonts w:eastAsia="Times New Roman"/>
-                <w:color w:val="1F1F1F"/>
-                <w:sz w:val="24"/>
-                <w:szCs w:val="24"/>
-                <w:bdr w:val="none" w:sz="0" w:space="0" w:color="auto" w:frame="1"/>
-                <w:lang w:eastAsia="ru-RU"/>
-              </w:rPr>
-              <w:t xml:space="preserve"> </w:t>
-            </w:r>
-            <w:proofErr w:type="spellStart"/>
-            <w:r>
-              <w:rPr>
-                <w:rFonts w:eastAsia="Times New Roman"/>
-                <w:color w:val="1F1F1F"/>
-                <w:sz w:val="24"/>
-                <w:szCs w:val="24"/>
-                <w:bdr w:val="none" w:sz="0" w:space="0" w:color="auto" w:frame="1"/>
-                <w:lang w:eastAsia="ru-RU"/>
-              </w:rPr>
-              <w:t>Machine</w:t>
-            </w:r>
-            <w:proofErr w:type="spellEnd"/>
-            <w:r>
-              <w:rPr>
-                <w:rFonts w:eastAsia="Times New Roman"/>
-                <w:color w:val="1F1F1F"/>
-                <w:sz w:val="24"/>
-                <w:szCs w:val="24"/>
-                <w:bdr w:val="none" w:sz="0" w:space="0" w:color="auto" w:frame="1"/>
-                <w:lang w:eastAsia="ru-RU"/>
-              </w:rPr>
-              <w:t>)</w:t>
+              <w:t xml:space="preserve"> Machine)</w:t>
             </w:r>
           </w:p>
         </w:tc>
@@ -29010,7 +29054,7 @@
           <w:lang w:eastAsia="ru-RU"/>
         </w:rPr>
         <w:pict w14:anchorId="2010E815">
-          <v:rect id="_x0000_i1145" style="width:0;height:1.5pt" o:hralign="center" o:hrstd="t" o:hrnoshade="t" o:hr="t" fillcolor="gray" stroked="f"/>
+          <v:rect id="_x0000_i1027" style="width:0;height:1.5pt" o:hralign="center" o:hrstd="t" o:hrnoshade="t" o:hr="t" fillcolor="gray" stroked="f"/>
         </w:pict>
       </w:r>
     </w:p>
@@ -30953,7 +30997,7 @@
           <w:lang w:eastAsia="ru-RU"/>
         </w:rPr>
         <w:pict w14:anchorId="43A4405A">
-          <v:rect id="_x0000_i1146" style="width:0;height:1.5pt" o:hralign="center" o:hrstd="t" o:hrnoshade="t" o:hr="t" fillcolor="gray" stroked="f"/>
+          <v:rect id="_x0000_i1028" style="width:0;height:1.5pt" o:hralign="center" o:hrstd="t" o:hrnoshade="t" o:hr="t" fillcolor="gray" stroked="f"/>
         </w:pict>
       </w:r>
     </w:p>
@@ -32859,10 +32903,56 @@
           <w:lang w:val="en-US"/>
         </w:rPr>
       </w:pPr>
-      <w:bookmarkStart w:id="0" w:name="_GoBack"/>
-      <w:bookmarkEnd w:id="0"/>
+      <w:r>
+        <w:rPr>
+          <w:rFonts w:eastAsiaTheme="minorEastAsia"/>
+          <w:lang w:val="en-US"/>
+        </w:rPr>
+        <w:br w:type="page"/>
+      </w:r>
+    </w:p>
+    <w:p>
+      <w:pPr>
+        <w:rPr>
+          <w:rFonts w:eastAsiaTheme="minorEastAsia"/>
+          <w:lang w:val="en-US"/>
+        </w:rPr>
+      </w:pPr>
+      <w:r>
+        <w:rPr>
+          <w:rFonts w:eastAsiaTheme="minorEastAsia"/>
+          <w:lang w:val="en-US"/>
+        </w:rPr>
+        <w:lastRenderedPageBreak/>
+        <w:br w:type="page"/>
+      </w:r>
+    </w:p>
+    <w:p>
+      <w:pPr>
+        <w:rPr>
+          <w:rFonts w:eastAsiaTheme="minorEastAsia"/>
+          <w:lang w:val="en-US"/>
+        </w:rPr>
+      </w:pPr>
+      <w:r>
+        <w:rPr>
+          <w:rFonts w:eastAsiaTheme="minorEastAsia"/>
+          <w:lang w:val="en-US"/>
+        </w:rPr>
+        <w:lastRenderedPageBreak/>
+        <w:br w:type="page"/>
+      </w:r>
+    </w:p>
+    <w:p>
+      <w:pPr>
+        <w:rPr>
+          <w:rFonts w:eastAsiaTheme="minorEastAsia"/>
+          <w:lang w:val="en-US"/>
+        </w:rPr>
+      </w:pPr>
     </w:p>
     <w:sectPr>
+      <w:footerReference w:type="default" r:id="rId10"/>
       <w:pgSz w:w="11906" w:h="16838"/>
       <w:pgMar w:top="1134" w:right="1134" w:bottom="1134" w:left="1134" w:header="709" w:footer="709" w:gutter="0"/>
       <w:cols w:space="708"/>
@@ -32872,8 +32962,95 @@
 </w:document>
 </file>
 
+<file path=word/endnotes.xml><?xml version="1.0" encoding="utf-8"?>
+<w:endnotes xmlns:wpc="http://schemas.microsoft.com/office/word/2010/wordprocessingCanvas" xmlns:cx="http://schemas.microsoft.com/office/drawing/2014/chartex" xmlns:cx1="http://schemas.microsoft.com/office/drawing/2015/9/8/chartex" xmlns:cx2="http://schemas.microsoft.com/office/drawing/2015/10/21/chartex" xmlns:cx3="http://schemas.microsoft.com/office/drawing/2016/5/9/chartex" xmlns:cx4="http://schemas.microsoft.com/office/drawing/2016/5/10/chartex" xmlns:cx5="http://schemas.microsoft.com/office/drawing/2016/5/11/chartex" xmlns:cx6="http://schemas.microsoft.com/office/drawing/2016/5/12/chartex" xmlns:cx7="http://schemas.microsoft.com/office/drawing/2016/5/13/chartex" xmlns:cx8="http://schemas.microsoft.com/office/drawing/2016/5/14/chartex" xmlns:mc="http://schemas.openxmlformats.org/markup-compatibility/2006" xmlns:aink="http://schemas.microsoft.com/office/drawing/2016/ink" xmlns:am3d="http://schemas.microsoft.com/office/drawing/2017/model3d" xmlns:o="urn:schemas-microsoft-com:office:office" xmlns:r="http://schemas.openxmlformats.org/officeDocument/2006/relationships" xmlns:m="http://schemas.openxmlformats.org/officeDocument/2006/math" xmlns:v="urn:schemas-microsoft-com:vml" xmlns:wp14="http://schemas.microsoft.com/office/word/2010/wordprocessingDrawing" xmlns:wp="http://schemas.openxmlformats.org/drawingml/2006/wordprocessingDrawing" xmlns:w10="urn:schemas-microsoft-com:office:word" xmlns:w="http://schemas.openxmlformats.org/wordprocessingml/2006/main" xmlns:w14="http://schemas.microsoft.com/office/word/2010/wordml" xmlns:w15="http://schemas.microsoft.com/office/word/2012/wordml" xmlns:w16cex="http://schemas.microsoft.com/office/word/2018/wordml/cex" xmlns:w16cid="http://schemas.microsoft.com/office/word/2016/wordml/cid" xmlns:w16="http://schemas.microsoft.com/office/word/2018/wordml" xmlns:w16sdtdh="http://schemas.microsoft.com/office/word/2020/wordml/sdtdatahash" xmlns:w16se="http://schemas.microsoft.com/office/word/2015/wordml/symex" xmlns:wpg="http://schemas.microsoft.com/office/word/2010/wordprocessingGroup" xmlns:wpi="http://schemas.microsoft.com/office/word/2010/wordprocessingInk" xmlns:wne="http://schemas.microsoft.com/office/word/2006/wordml" xmlns:wps="http://schemas.microsoft.com/office/word/2010/wordprocessingShape" mc:Ignorable="w14 w15 w16se w16cid w16 w16cex w16sdtdh wp14">
+  <w:endnote w:type="separator" w:id="-1">
+    <w:p>
+      <w:pPr>
+        <w:spacing w:after="0" w:line="240" w:lineRule="auto"/>
+      </w:pPr>
+      <w:r>
+        <w:separator/>
+      </w:r>
+    </w:p>
+  </w:endnote>
+  <w:endnote w:type="continuationSeparator" w:id="0">
+    <w:p>
+      <w:pPr>
+        <w:spacing w:after="0" w:line="240" w:lineRule="auto"/>
+      </w:pPr>
+      <w:r>
+        <w:continuationSeparator/>
+      </w:r>
+    </w:p>
+  </w:endnote>
+</w:endnotes>
+</file>
+
+<file path=word/footer1.xml><?xml version="1.0" encoding="utf-8"?>
+<w:ftr xmlns:wpc="http://schemas.microsoft.com/office/word/2010/wordprocessingCanvas" xmlns:cx="http://schemas.microsoft.com/office/drawing/2014/chartex" xmlns:cx1="http://schemas.microsoft.com/office/drawing/2015/9/8/chartex" xmlns:cx2="http://schemas.microsoft.com/office/drawing/2015/10/21/chartex" xmlns:cx3="http://schemas.microsoft.com/office/drawing/2016/5/9/chartex" xmlns:cx4="http://schemas.microsoft.com/office/drawing/2016/5/10/chartex" xmlns:cx5="http://schemas.microsoft.com/office/drawing/2016/5/11/chartex" xmlns:cx6="http://schemas.microsoft.com/office/drawing/2016/5/12/chartex" xmlns:cx7="http://schemas.microsoft.com/office/drawing/2016/5/13/chartex" xmlns:cx8="http://schemas.microsoft.com/office/drawing/2016/5/14/chartex" xmlns:mc="http://schemas.openxmlformats.org/markup-compatibility/2006" xmlns:aink="http://schemas.microsoft.com/office/drawing/2016/ink" xmlns:am3d="http://schemas.microsoft.com/office/drawing/2017/model3d" xmlns:o="urn:schemas-microsoft-com:office:office" xmlns:r="http://schemas.openxmlformats.org/officeDocument/2006/relationships" xmlns:m="http://schemas.openxmlformats.org/officeDocument/2006/math" xmlns:v="urn:schemas-microsoft-com:vml" xmlns:wp14="http://schemas.microsoft.com/office/word/2010/wordprocessingDrawing" xmlns:wp="http://schemas.openxmlformats.org/drawingml/2006/wordprocessingDrawing" xmlns:w10="urn:schemas-microsoft-com:office:word" xmlns:w="http://schemas.openxmlformats.org/wordprocessingml/2006/main" xmlns:w14="http://schemas.microsoft.com/office/word/2010/wordml" xmlns:w15="http://schemas.microsoft.com/office/word/2012/wordml" xmlns:w16cex="http://schemas.microsoft.com/office/word/2018/wordml/cex" xmlns:w16cid="http://schemas.microsoft.com/office/word/2016/wordml/cid" xmlns:w16="http://schemas.microsoft.com/office/word/2018/wordml" xmlns:w16sdtdh="http://schemas.microsoft.com/office/word/2020/wordml/sdtdatahash" xmlns:w16se="http://schemas.microsoft.com/office/word/2015/wordml/symex" xmlns:wpg="http://schemas.microsoft.com/office/word/2010/wordprocessingGroup" xmlns:wpi="http://schemas.microsoft.com/office/word/2010/wordprocessingInk" xmlns:wne="http://schemas.microsoft.com/office/word/2006/wordml" xmlns:wps="http://schemas.microsoft.com/office/word/2010/wordprocessingShape" mc:Ignorable="w14 w15 w16se w16cid w16 w16cex w16sdtdh wp14">
+  <w:sdt>
+    <w:sdtPr>
+      <w:id w:val="680390698"/>
+      <w:docPartObj>
+        <w:docPartGallery w:val="Page Numbers (Bottom of Page)"/>
+        <w:docPartUnique/>
+      </w:docPartObj>
+    </w:sdtPr>
+    <w:sdtContent>
+      <w:p>
+        <w:pPr>
+          <w:pStyle w:val="a9"/>
+          <w:jc w:val="center"/>
+        </w:pPr>
+        <w:r>
+          <w:fldChar w:fldCharType="begin"/>
+        </w:r>
+        <w:r>
+          <w:instrText>PAGE   \* MERGEFORMAT</w:instrText>
+        </w:r>
+        <w:r>
+          <w:fldChar w:fldCharType="separate"/>
+        </w:r>
+        <w:r>
+          <w:t>2</w:t>
+        </w:r>
+        <w:r>
+          <w:fldChar w:fldCharType="end"/>
+        </w:r>
+      </w:p>
+    </w:sdtContent>
+  </w:sdt>
+</w:ftr>
+</file>
+
+<file path=word/footnotes.xml><?xml version="1.0" encoding="utf-8"?>
+<w:footnotes xmlns:wpc="http://schemas.microsoft.com/office/word/2010/wordprocessingCanvas" xmlns:cx="http://schemas.microsoft.com/office/drawing/2014/chartex" xmlns:cx1="http://schemas.microsoft.com/office/drawing/2015/9/8/chartex" xmlns:cx2="http://schemas.microsoft.com/office/drawing/2015/10/21/chartex" xmlns:cx3="http://schemas.microsoft.com/office/drawing/2016/5/9/chartex" xmlns:cx4="http://schemas.microsoft.com/office/drawing/2016/5/10/chartex" xmlns:cx5="http://schemas.microsoft.com/office/drawing/2016/5/11/chartex" xmlns:cx6="http://schemas.microsoft.com/office/drawing/2016/5/12/chartex" xmlns:cx7="http://schemas.microsoft.com/office/drawing/2016/5/13/chartex" xmlns:cx8="http://schemas.microsoft.com/office/drawing/2016/5/14/chartex" xmlns:mc="http://schemas.openxmlformats.org/markup-compatibility/2006" xmlns:aink="http://schemas.microsoft.com/office/drawing/2016/ink" xmlns:am3d="http://schemas.microsoft.com/office/drawing/2017/model3d" xmlns:o="urn:schemas-microsoft-com:office:office" xmlns:r="http://schemas.openxmlformats.org/officeDocument/2006/relationships" xmlns:m="http://schemas.openxmlformats.org/officeDocument/2006/math" xmlns:v="urn:schemas-microsoft-com:vml" xmlns:wp14="http://schemas.microsoft.com/office/word/2010/wordprocessingDrawing" xmlns:wp="http://schemas.openxmlformats.org/drawingml/2006/wordprocessingDrawing" xmlns:w10="urn:schemas-microsoft-com:office:word" xmlns:w="http://schemas.openxmlformats.org/wordprocessingml/2006/main" xmlns:w14="http://schemas.microsoft.com/office/word/2010/wordml" xmlns:w15="http://schemas.microsoft.com/office/word/2012/wordml" xmlns:w16cex="http://schemas.microsoft.com/office/word/2018/wordml/cex" xmlns:w16cid="http://schemas.microsoft.com/office/word/2016/wordml/cid" xmlns:w16="http://schemas.microsoft.com/office/word/2018/wordml" xmlns:w16sdtdh="http://schemas.microsoft.com/office/word/2020/wordml/sdtdatahash" xmlns:w16se="http://schemas.microsoft.com/office/word/2015/wordml/symex" xmlns:wpg="http://schemas.microsoft.com/office/word/2010/wordprocessingGroup" xmlns:wpi="http://schemas.microsoft.com/office/word/2010/wordprocessingInk" xmlns:wne="http://schemas.microsoft.com/office/word/2006/wordml" xmlns:wps="http://schemas.microsoft.com/office/word/2010/wordprocessingShape" mc:Ignorable="w14 w15 w16se w16cid w16 w16cex w16sdtdh wp14">
+  <w:footnote w:type="separator" w:id="-1">
+    <w:p>
+      <w:pPr>
+        <w:spacing w:after="0" w:line="240" w:lineRule="auto"/>
+      </w:pPr>
+      <w:r>
+        <w:separator/>
+      </w:r>
+    </w:p>
+  </w:footnote>
+  <w:footnote w:type="continuationSeparator" w:id="0">
+    <w:p>
+      <w:pPr>
+        <w:spacing w:after="0" w:line="240" w:lineRule="auto"/>
+      </w:pPr>
+      <w:r>
+        <w:continuationSeparator/>
+      </w:r>
+    </w:p>
+  </w:footnote>
+</w:footnotes>
+</file>
+
 <file path=word/numbering.xml><?xml version="1.0" encoding="utf-8"?>
-<w:numbering xmlns:wpc="http://schemas.microsoft.com/office/word/2010/wordprocessingCanvas" xmlns:cx="http://schemas.microsoft.com/office/drawing/2014/chartex" xmlns:cx1="http://schemas.microsoft.com/office/drawing/2015/9/8/chartex" xmlns:cx2="http://schemas.microsoft.com/office/drawing/2015/10/21/chartex" xmlns:cx3="http://schemas.microsoft.com/office/drawing/2016/5/9/chartex" xmlns:cx4="http://schemas.microsoft.com/office/drawing/2016/5/10/chartex" xmlns:cx5="http://schemas.microsoft.com/office/drawing/2016/5/11/chartex" xmlns:cx6="http://schemas.microsoft.com/office/drawing/2016/5/12/chartex" xmlns:cx7="http://schemas.microsoft.com/office/drawing/2016/5/13/chartex" xmlns:cx8="http://schemas.microsoft.com/office/drawing/2016/5/14/chartex" xmlns:mc="http://schemas.openxmlformats.org/markup-compatibility/2006" xmlns:aink="http://schemas.microsoft.com/office/drawing/2016/ink" xmlns:am3d="http://schemas.microsoft.com/office/drawing/2017/model3d" xmlns:o="urn:schemas-microsoft-com:office:office" xmlns:r="http://schemas.openxmlformats.org/officeDocument/2006/relationships" xmlns:m="http://schemas.openxmlformats.org/officeDocument/2006/math" xmlns:v="urn:schemas-microsoft-com:vml" xmlns:wp14="http://schemas.microsoft.com/office/word/2010/wordprocessingDrawing" xmlns:wp="http://schemas.openxmlformats.org/drawingml/2006/wordprocessingDrawing" xmlns:w10="urn:schemas-microsoft-com:office:word" xmlns:w="http://schemas.openxmlformats.org/wordprocessingml/2006/main" xmlns:w14="http://schemas.microsoft.com/office/word/2010/wordml" xmlns:w15="http://schemas.microsoft.com/office/word/2012/wordml" xmlns:w16cid="http://schemas.microsoft.com/office/word/2016/wordml/cid" xmlns:w16se="http://schemas.microsoft.com/office/word/2015/wordml/symex" xmlns:wpg="http://schemas.microsoft.com/office/word/2010/wordprocessingGroup" xmlns:wpi="http://schemas.microsoft.com/office/word/2010/wordprocessingInk" xmlns:wne="http://schemas.microsoft.com/office/word/2006/wordml" xmlns:wps="http://schemas.microsoft.com/office/word/2010/wordprocessingShape" mc:Ignorable="w14 w15 w16se w16cid wp14">
+<w:numbering xmlns:wpc="http://schemas.microsoft.com/office/word/2010/wordprocessingCanvas" xmlns:cx="http://schemas.microsoft.com/office/drawing/2014/chartex" xmlns:cx1="http://schemas.microsoft.com/office/drawing/2015/9/8/chartex" xmlns:cx2="http://schemas.microsoft.com/office/drawing/2015/10/21/chartex" xmlns:cx3="http://schemas.microsoft.com/office/drawing/2016/5/9/chartex" xmlns:cx4="http://schemas.microsoft.com/office/drawing/2016/5/10/chartex" xmlns:cx5="http://schemas.microsoft.com/office/drawing/2016/5/11/chartex" xmlns:cx6="http://schemas.microsoft.com/office/drawing/2016/5/12/chartex" xmlns:cx7="http://schemas.microsoft.com/office/drawing/2016/5/13/chartex" xmlns:cx8="http://schemas.microsoft.com/office/drawing/2016/5/14/chartex" xmlns:mc="http://schemas.openxmlformats.org/markup-compatibility/2006" xmlns:aink="http://schemas.microsoft.com/office/drawing/2016/ink" xmlns:am3d="http://schemas.microsoft.com/office/drawing/2017/model3d" xmlns:o="urn:schemas-microsoft-com:office:office" xmlns:r="http://schemas.openxmlformats.org/officeDocument/2006/relationships" xmlns:m="http://schemas.openxmlformats.org/officeDocument/2006/math" xmlns:v="urn:schemas-microsoft-com:vml" xmlns:wp14="http://schemas.microsoft.com/office/word/2010/wordprocessingDrawing" xmlns:wp="http://schemas.openxmlformats.org/drawingml/2006/wordprocessingDrawing" xmlns:w10="urn:schemas-microsoft-com:office:word" xmlns:w="http://schemas.openxmlformats.org/wordprocessingml/2006/main" xmlns:w14="http://schemas.microsoft.com/office/word/2010/wordml" xmlns:w15="http://schemas.microsoft.com/office/word/2012/wordml" xmlns:w16cex="http://schemas.microsoft.com/office/word/2018/wordml/cex" xmlns:w16cid="http://schemas.microsoft.com/office/word/2016/wordml/cid" xmlns:w16="http://schemas.microsoft.com/office/word/2018/wordml" xmlns:w16sdtdh="http://schemas.microsoft.com/office/word/2020/wordml/sdtdatahash" xmlns:w16se="http://schemas.microsoft.com/office/word/2015/wordml/symex" xmlns:wpg="http://schemas.microsoft.com/office/word/2010/wordprocessingGroup" xmlns:wpi="http://schemas.microsoft.com/office/word/2010/wordprocessingInk" xmlns:wne="http://schemas.microsoft.com/office/word/2006/wordml" xmlns:wps="http://schemas.microsoft.com/office/word/2010/wordprocessingShape" mc:Ignorable="w14 w15 w16se w16cid w16 w16cex w16sdtdh wp14">
   <w:abstractNum w:abstractNumId="0" w15:restartNumberingAfterBreak="0">
     <w:nsid w:val="1DA631A5"/>
     <w:multiLevelType w:val="multilevel"/>
@@ -34818,7 +34995,7 @@
 </file>
 
 <file path=word/styles.xml><?xml version="1.0" encoding="utf-8"?>
-<w:styles xmlns:mc="http://schemas.openxmlformats.org/markup-compatibility/2006" xmlns:r="http://schemas.openxmlformats.org/officeDocument/2006/relationships" xmlns:w="http://schemas.openxmlformats.org/wordprocessingml/2006/main" xmlns:w14="http://schemas.microsoft.com/office/word/2010/wordml" xmlns:w15="http://schemas.microsoft.com/office/word/2012/wordml" xmlns:w16cid="http://schemas.microsoft.com/office/word/2016/wordml/cid" xmlns:w16se="http://schemas.microsoft.com/office/word/2015/wordml/symex" mc:Ignorable="w14 w15 w16se w16cid">
+<w:styles xmlns:mc="http://schemas.openxmlformats.org/markup-compatibility/2006" xmlns:r="http://schemas.openxmlformats.org/officeDocument/2006/relationships" xmlns:w="http://schemas.openxmlformats.org/wordprocessingml/2006/main" xmlns:w14="http://schemas.microsoft.com/office/word/2010/wordml" xmlns:w15="http://schemas.microsoft.com/office/word/2012/wordml" xmlns:w16cex="http://schemas.microsoft.com/office/word/2018/wordml/cex" xmlns:w16cid="http://schemas.microsoft.com/office/word/2016/wordml/cid" xmlns:w16="http://schemas.microsoft.com/office/word/2018/wordml" xmlns:w16sdtdh="http://schemas.microsoft.com/office/word/2020/wordml/sdtdatahash" xmlns:w16se="http://schemas.microsoft.com/office/word/2015/wordml/symex" mc:Ignorable="w14 w15 w16se w16cid w16 w16cex w16sdtdh">
   <w:docDefaults>
     <w:rPrDefault>
       <w:rPr>
@@ -34834,7 +35011,7 @@
       </w:pPr>
     </w:pPrDefault>
   </w:docDefaults>
-  <w:latentStyles w:defLockedState="0" w:defUIPriority="99" w:defSemiHidden="0" w:defUnhideWhenUsed="0" w:defQFormat="0" w:count="377">
+  <w:latentStyles w:defLockedState="0" w:defUIPriority="99" w:defSemiHidden="0" w:defUnhideWhenUsed="0" w:defQFormat="0" w:count="376">
     <w:lsdException w:name="Normal" w:uiPriority="0" w:qFormat="1"/>
     <w:lsdException w:name="heading 1" w:uiPriority="9" w:qFormat="1"/>
     <w:lsdException w:name="heading 2" w:semiHidden="1" w:uiPriority="9" w:unhideWhenUsed="1" w:qFormat="1"/>
@@ -35211,7 +35388,6 @@
     <w:lsdException w:name="Hashtag" w:semiHidden="1" w:unhideWhenUsed="1"/>
     <w:lsdException w:name="Unresolved Mention" w:semiHidden="1" w:unhideWhenUsed="1"/>
     <w:lsdException w:name="Smart Link" w:semiHidden="1" w:unhideWhenUsed="1"/>
-    <w:lsdException w:name="Smart Link Error" w:semiHidden="1" w:unhideWhenUsed="1"/>
   </w:latentStyles>
   <w:style w:type="paragraph" w:default="1" w:styleId="a">
     <w:name w:val="Normal"/>
@@ -35345,6 +35521,50 @@
     <w:rPr>
       <w:color w:val="808080"/>
     </w:rPr>
+  </w:style>
+  <w:style w:type="paragraph" w:styleId="a7">
+    <w:name w:val="header"/>
+    <w:basedOn w:val="a"/>
+    <w:link w:val="a8"/>
+    <w:uiPriority w:val="99"/>
+    <w:unhideWhenUsed/>
+    <w:rsid w:val="009772BF"/>
+    <w:pPr>
+      <w:tabs>
+        <w:tab w:val="center" w:pos="4677"/>
+        <w:tab w:val="right" w:pos="9355"/>
+      </w:tabs>
+      <w:spacing w:after="0" w:line="240" w:lineRule="auto"/>
+    </w:pPr>
+  </w:style>
+  <w:style w:type="character" w:customStyle="1" w:styleId="a8">
+    <w:name w:val="Верхний колонтитул Знак"/>
+    <w:basedOn w:val="a0"/>
+    <w:link w:val="a7"/>
+    <w:uiPriority w:val="99"/>
+    <w:rsid w:val="009772BF"/>
+  </w:style>
+  <w:style w:type="paragraph" w:styleId="a9">
+    <w:name w:val="footer"/>
+    <w:basedOn w:val="a"/>
+    <w:link w:val="aa"/>
+    <w:uiPriority w:val="99"/>
+    <w:unhideWhenUsed/>
+    <w:rsid w:val="009772BF"/>
+    <w:pPr>
+      <w:tabs>
+        <w:tab w:val="center" w:pos="4677"/>
+        <w:tab w:val="right" w:pos="9355"/>
+      </w:tabs>
+      <w:spacing w:after="0" w:line="240" w:lineRule="auto"/>
+    </w:pPr>
+  </w:style>
+  <w:style w:type="character" w:customStyle="1" w:styleId="aa">
+    <w:name w:val="Нижний колонтитул Знак"/>
+    <w:basedOn w:val="a0"/>
+    <w:link w:val="a9"/>
+    <w:uiPriority w:val="99"/>
+    <w:rsid w:val="009772BF"/>
   </w:style>
 </w:styles>
 </file>

</xml_diff>